<commit_message>
Design review: align modernization deck and brief to GitHub brand
- Palette: remove the one off-palette grey; all deck colours are now GitHub
  Hero Green, Green 5, Gray 1-6 and Copilot Purple. Green = real/today,
  purple = illustrative/proposed, diamond = human review gate.
- Typography: Mona Sans for display type, Arial for body (portability);
  Mona Sans headings in the Word brief; table borders recoloured to Gray 3.
- Infographics: 10x10 unit charts for the 57% / 44% stats, journey and
  pipeline strips (slide 5), gate-diamond pilot timeline (slide 6), and a
  true 2x2 with labelled axes (slide 9). Illustrative chips on slides 5-8.

No plugin or runtime code changed.

Co-authored-by: Copilot App <223556219+Copilot@users.noreply.github.com>
Copilot-Session: 24d04258-e14d-4dd6-a1ad-be3265e56239
</commit_message>
<xml_diff>
--- a/submission/modernization-brief.docx
+++ b/submission/modernization-brief.docx
@@ -1776,7 +1776,7 @@
     </w:pPr>
     <w:r>
       <w:rPr>
-        <w:color w:val="505B53"/>
+        <w:color w:val="232925"/>
         <w:sz w:val="16"/>
       </w:rPr>
       <w:t xml:space="preserve">Customer project proposal  |  Independent prototype  |  </w:t>
@@ -2234,7 +2234,7 @@
       <w:outlineLvl w:val="0"/>
     </w:pPr>
     <w:rPr>
-      <w:rFonts w:asciiTheme="majorHAnsi" w:eastAsiaTheme="majorEastAsia" w:hAnsiTheme="majorHAnsi" w:cstheme="majorBidi" w:ascii="Arial" w:hAnsi="Arial"/>
+      <w:rFonts w:ascii="Mona Sans" w:hAnsi="Mona Sans"/>
       <w:b/>
       <w:bCs/>
       <w:color w:val="101411"/>
@@ -2258,7 +2258,7 @@
       <w:outlineLvl w:val="1"/>
     </w:pPr>
     <w:rPr>
-      <w:rFonts w:asciiTheme="majorHAnsi" w:eastAsiaTheme="majorEastAsia" w:hAnsiTheme="majorHAnsi" w:cstheme="majorBidi" w:ascii="Arial" w:hAnsi="Arial"/>
+      <w:rFonts w:ascii="Mona Sans" w:hAnsi="Mona Sans"/>
       <w:b/>
       <w:bCs/>
       <w:color w:val="08872B"/>
@@ -2282,7 +2282,7 @@
       <w:outlineLvl w:val="2"/>
     </w:pPr>
     <w:rPr>
-      <w:rFonts w:asciiTheme="majorHAnsi" w:eastAsiaTheme="majorEastAsia" w:hAnsiTheme="majorHAnsi" w:cstheme="majorBidi" w:ascii="Arial" w:hAnsi="Arial"/>
+      <w:rFonts w:ascii="Mona Sans" w:hAnsi="Mona Sans"/>
       <w:b/>
       <w:bCs/>
       <w:color w:val="08872B"/>
@@ -2524,7 +2524,7 @@
       <w:contextualSpacing/>
     </w:pPr>
     <w:rPr>
-      <w:rFonts w:asciiTheme="majorHAnsi" w:eastAsiaTheme="majorEastAsia" w:hAnsiTheme="majorHAnsi" w:cstheme="majorBidi" w:ascii="Arial" w:hAnsi="Arial"/>
+      <w:rFonts w:ascii="Mona Sans" w:hAnsi="Mona Sans"/>
       <w:b/>
       <w:color w:val="101411"/>
       <w:spacing w:val="5"/>
@@ -2563,11 +2563,11 @@
       <w:spacing w:before="240" w:after="120"/>
     </w:pPr>
     <w:rPr>
-      <w:rFonts w:asciiTheme="majorHAnsi" w:eastAsiaTheme="majorEastAsia" w:hAnsiTheme="majorHAnsi" w:cstheme="majorBidi" w:ascii="Arial" w:hAnsi="Arial"/>
+      <w:rFonts w:ascii="Arial" w:hAnsi="Arial"/>
       <w:b/>
       <w:i/>
       <w:iCs/>
-      <w:color w:val="505B53"/>
+      <w:color w:val="232925"/>
       <w:spacing w:val="15"/>
       <w:sz w:val="32"/>
       <w:szCs w:val="24"/>
@@ -3125,18 +3125,18 @@
     <w:tblPr>
       <w:tblInd w:w="0" w:type="dxa"/>
       <w:tblBorders>
-        <w:top w:val="single" w:sz="4" w:space="0" w:color="auto"/>
-        <w:left w:val="single" w:sz="4" w:space="0" w:color="auto"/>
-        <w:bottom w:val="single" w:sz="4" w:space="0" w:color="auto"/>
-        <w:right w:val="single" w:sz="4" w:space="0" w:color="auto"/>
-        <w:insideH w:val="single" w:sz="4" w:space="0" w:color="auto"/>
-        <w:insideV w:val="single" w:sz="4" w:space="0" w:color="auto"/>
+        <w:top w:val="single" w:sz="4" w:space="0" w:color="B6BFB8"/>
+        <w:left w:val="single" w:sz="4" w:space="0" w:color="B6BFB8"/>
+        <w:bottom w:val="single" w:sz="4" w:space="0" w:color="B6BFB8"/>
+        <w:right w:val="single" w:sz="4" w:space="0" w:color="B6BFB8"/>
+        <w:insideH w:val="single" w:sz="4" w:space="0" w:color="B6BFB8"/>
+        <w:insideV w:val="single" w:sz="4" w:space="0" w:color="B6BFB8"/>
       </w:tblBorders>
       <w:tblCellMar>
-        <w:top w:w="0" w:type="dxa"/>
-        <w:left w:w="108" w:type="dxa"/>
-        <w:bottom w:w="0" w:type="dxa"/>
-        <w:right w:w="108" w:type="dxa"/>
+        <w:top w:w="0" w:type="dxa" w:color="B6BFB8"/>
+        <w:left w:w="108" w:type="dxa" w:color="B6BFB8"/>
+        <w:bottom w:w="0" w:type="dxa" w:color="B6BFB8"/>
+        <w:right w:w="108" w:type="dxa" w:color="B6BFB8"/>
       </w:tblCellMar>
     </w:tblPr>
   </w:style>

</xml_diff>